<commit_message>
Update Supplementary Table S1: benchmark with 10 reps + DuckDB comparison
- SPARQL mean ± SD for all 8 queries (10 reps, warmup 3)
- DuckDB/SQL comparison for all queries
- Speedup range: 4x (Q5) to 629x (Q1)
- Note on Q7 cache warm-up effect (SD=0.793s)
- Hardware and software versions documented
</commit_message>
<xml_diff>
--- a/docs/tables/Supplementary_Table_S1.docx
+++ b/docs/tables/Supplementary_Table_S1.docx
@@ -31,7 +31,33 @@
           <w:sz w:val="20"/>
           <w:szCs w:val="20"/>
         </w:rPr>
-        <w:t xml:space="preserve"> SPARQL query benchmark over 13,334,157 RDF triples (PerinatalKG, Goiás state, Brazil, 2015–2024; Apache Jena Fuseki 6.0.0, TDB2 persistent storage; AMD Ryzen 9 3900X, 24 threads, 64 GB RAM, Ubuntu Linux). All queries use the following prefix declarations: </w:t>
+        <w:t xml:space="preserve"> SPARQL vs SQL (DuckDB) query benchmark over 13,334,157 RDF triples (PerinatalKG) and 934,806 Parquet rows, respectively (Goiás state, Brazil, 2015–2024). Each query was executed 10 times after 3 warmup repetitions (seed 20260803). SPARQL queries ran against Apache Jena Fuseki 6.0.0 (TDB2); SQL queries ran against DuckDB 1.5.2 in-memory over Parquet files loaded via </w:t>
+      </w:r>
+      <w:r>
+        <w:rPr>
+          <w:rFonts w:ascii="Courier New" w:cs="Courier New" w:eastAsia="Courier New" w:hAnsi="Courier New"/>
+          <w:b w:val="false"/>
+          <w:bCs w:val="false"/>
+          <w:i w:val="false"/>
+          <w:iCs w:val="false"/>
+          <w:color w:val="000000"/>
+          <w:sz w:val="17"/>
+          <w:szCs w:val="17"/>
+        </w:rPr>
+        <w:t xml:space="preserve">read_parquet()</w:t>
+      </w:r>
+      <w:r>
+        <w:rPr>
+          <w:rFonts w:ascii="Times New Roman" w:cs="Times New Roman" w:eastAsia="Times New Roman" w:hAnsi="Times New Roman"/>
+          <w:b w:val="false"/>
+          <w:bCs w:val="false"/>
+          <w:i w:val="false"/>
+          <w:iCs w:val="false"/>
+          <w:color w:val="000000"/>
+          <w:sz w:val="20"/>
+          <w:szCs w:val="20"/>
+        </w:rPr>
+        <w:t xml:space="preserve">. Hardware: AMD Ryzen 9 3900X (24 threads, 64 GB RAM, Ubuntu Linux). All SPARQL queries use </w:t>
       </w:r>
       <w:r>
         <w:rPr>
@@ -83,7 +109,7 @@
           <w:sz w:val="20"/>
           <w:szCs w:val="20"/>
         </w:rPr>
-        <w:t xml:space="preserve">. Times are wall-clock single-run measurements with no query cache active. The complete query set is available at https://github.com/clarimar/perinatalkg/tree/main/examples.</w:t>
+        <w:t xml:space="preserve">. Speedup = SPARQL mean / SQL mean. Results and script available at https://github.com/clarimar/perinatalkg/tree/main/results.</w:t>
       </w:r>
     </w:p>
     <w:tbl>
@@ -99,11 +125,15 @@
         </w:tblBorders>
       </w:tblPr>
       <w:tblGrid>
+        <w:gridCol w:w="500"/>
+        <w:gridCol w:w="2000"/>
+        <w:gridCol w:w="4000"/>
+        <w:gridCol w:w="1400"/>
+        <w:gridCol w:w="1000"/>
         <w:gridCol w:w="900"/>
-        <w:gridCol w:w="3000"/>
-        <w:gridCol w:w="5400"/>
-        <w:gridCol w:w="1800"/>
-        <w:gridCol w:w="1100"/>
+        <w:gridCol w:w="900"/>
+        <w:gridCol w:w="800"/>
+        <w:gridCol w:w="1300"/>
       </w:tblGrid>
       <w:tr>
         <w:trPr>
@@ -127,7 +157,7 @@
           <w:p>
             <w:pPr>
               <w:spacing w:after="0" w:before="0"/>
-              <w:jc w:val="left"/>
+              <w:jc w:val="center"/>
             </w:pPr>
             <w:r>
               <w:rPr>
@@ -140,7 +170,7 @@
                 <w:sz w:val="20"/>
                 <w:szCs w:val="20"/>
               </w:rPr>
-              <w:t xml:space="preserve">Query</w:t>
+              <w:t xml:space="preserve">Q</w:t>
             </w:r>
           </w:p>
         </w:tc>
@@ -280,7 +310,152 @@
                 <w:sz w:val="20"/>
                 <w:szCs w:val="20"/>
               </w:rPr>
-              <w:t xml:space="preserve">Time (s)</w:t>
+              <w:t xml:space="preserve">SPARQL
+mean (s)</w:t>
+            </w:r>
+          </w:p>
+        </w:tc>
+        <w:tc>
+          <w:tcPr>
+            <w:tcBorders>
+              <w:top w:val="single" w:color="000000" w:sz="12" w:space="1"/>
+              <w:left w:val="none" w:color="FFFFFF" w:sz="0"/>
+              <w:bottom w:val="single" w:color="000000" w:sz="6" w:space="1"/>
+              <w:right w:val="none" w:color="FFFFFF" w:sz="0"/>
+            </w:tcBorders>
+            <w:tcMar>
+              <w:top w:type="dxa" w:w="80"/>
+              <w:left w:type="dxa" w:w="160"/>
+              <w:bottom w:type="dxa" w:w="80"/>
+              <w:right w:type="dxa" w:w="160"/>
+            </w:tcMar>
+          </w:tcPr>
+          <w:p>
+            <w:pPr>
+              <w:spacing w:after="0" w:before="0"/>
+              <w:jc w:val="right"/>
+            </w:pPr>
+            <w:r>
+              <w:rPr>
+                <w:rFonts w:ascii="Times New Roman" w:cs="Times New Roman" w:eastAsia="Times New Roman" w:hAnsi="Times New Roman"/>
+                <w:b/>
+                <w:bCs/>
+                <w:i w:val="false"/>
+                <w:iCs w:val="false"/>
+                <w:color w:val="000000"/>
+                <w:sz w:val="20"/>
+                <w:szCs w:val="20"/>
+              </w:rPr>
+              <w:t xml:space="preserve">SPARQL
+SD (s)</w:t>
+            </w:r>
+          </w:p>
+        </w:tc>
+        <w:tc>
+          <w:tcPr>
+            <w:tcBorders>
+              <w:top w:val="single" w:color="000000" w:sz="12" w:space="1"/>
+              <w:left w:val="none" w:color="FFFFFF" w:sz="0"/>
+              <w:bottom w:val="single" w:color="000000" w:sz="6" w:space="1"/>
+              <w:right w:val="none" w:color="FFFFFF" w:sz="0"/>
+            </w:tcBorders>
+            <w:tcMar>
+              <w:top w:type="dxa" w:w="80"/>
+              <w:left w:type="dxa" w:w="160"/>
+              <w:bottom w:type="dxa" w:w="80"/>
+              <w:right w:type="dxa" w:w="160"/>
+            </w:tcMar>
+          </w:tcPr>
+          <w:p>
+            <w:pPr>
+              <w:spacing w:after="0" w:before="0"/>
+              <w:jc w:val="right"/>
+            </w:pPr>
+            <w:r>
+              <w:rPr>
+                <w:rFonts w:ascii="Times New Roman" w:cs="Times New Roman" w:eastAsia="Times New Roman" w:hAnsi="Times New Roman"/>
+                <w:b/>
+                <w:bCs/>
+                <w:i w:val="false"/>
+                <w:iCs w:val="false"/>
+                <w:color w:val="000000"/>
+                <w:sz w:val="20"/>
+                <w:szCs w:val="20"/>
+              </w:rPr>
+              <w:t xml:space="preserve">SQL
+mean (s)</w:t>
+            </w:r>
+          </w:p>
+        </w:tc>
+        <w:tc>
+          <w:tcPr>
+            <w:tcBorders>
+              <w:top w:val="single" w:color="000000" w:sz="12" w:space="1"/>
+              <w:left w:val="none" w:color="FFFFFF" w:sz="0"/>
+              <w:bottom w:val="single" w:color="000000" w:sz="6" w:space="1"/>
+              <w:right w:val="none" w:color="FFFFFF" w:sz="0"/>
+            </w:tcBorders>
+            <w:tcMar>
+              <w:top w:type="dxa" w:w="80"/>
+              <w:left w:type="dxa" w:w="160"/>
+              <w:bottom w:type="dxa" w:w="80"/>
+              <w:right w:type="dxa" w:w="160"/>
+            </w:tcMar>
+          </w:tcPr>
+          <w:p>
+            <w:pPr>
+              <w:spacing w:after="0" w:before="0"/>
+              <w:jc w:val="right"/>
+            </w:pPr>
+            <w:r>
+              <w:rPr>
+                <w:rFonts w:ascii="Times New Roman" w:cs="Times New Roman" w:eastAsia="Times New Roman" w:hAnsi="Times New Roman"/>
+                <w:b/>
+                <w:bCs/>
+                <w:i w:val="false"/>
+                <w:iCs w:val="false"/>
+                <w:color w:val="000000"/>
+                <w:sz w:val="20"/>
+                <w:szCs w:val="20"/>
+              </w:rPr>
+              <w:t xml:space="preserve">SQL
+SD (s)</w:t>
+            </w:r>
+          </w:p>
+        </w:tc>
+        <w:tc>
+          <w:tcPr>
+            <w:tcBorders>
+              <w:top w:val="single" w:color="000000" w:sz="12" w:space="1"/>
+              <w:left w:val="none" w:color="FFFFFF" w:sz="0"/>
+              <w:bottom w:val="single" w:color="000000" w:sz="6" w:space="1"/>
+              <w:right w:val="none" w:color="FFFFFF" w:sz="0"/>
+            </w:tcBorders>
+            <w:tcMar>
+              <w:top w:type="dxa" w:w="80"/>
+              <w:left w:type="dxa" w:w="160"/>
+              <w:bottom w:type="dxa" w:w="80"/>
+              <w:right w:type="dxa" w:w="160"/>
+            </w:tcMar>
+          </w:tcPr>
+          <w:p>
+            <w:pPr>
+              <w:spacing w:after="0" w:before="0"/>
+              <w:jc w:val="right"/>
+            </w:pPr>
+            <w:r>
+              <w:rPr>
+                <w:rFonts w:ascii="Times New Roman" w:cs="Times New Roman" w:eastAsia="Times New Roman" w:hAnsi="Times New Roman"/>
+                <w:b/>
+                <w:bCs/>
+                <w:i w:val="false"/>
+                <w:iCs w:val="false"/>
+                <w:color w:val="000000"/>
+                <w:sz w:val="20"/>
+                <w:szCs w:val="20"/>
+              </w:rPr>
+              <w:t xml:space="preserve">Speedup
+(SPARQL/SQL)</w:t>
             </w:r>
           </w:p>
         </w:tc>
@@ -304,7 +479,7 @@
           <w:p>
             <w:pPr>
               <w:spacing w:after="0" w:before="0"/>
-              <w:jc w:val="left"/>
+              <w:jc w:val="center"/>
             </w:pPr>
             <w:r>
               <w:rPr>
@@ -352,7 +527,26 @@
                 <w:sz w:val="20"/>
                 <w:szCs w:val="20"/>
               </w:rPr>
-              <w:t xml:space="preserve">Total triple count</w:t>
+              <w:t xml:space="preserve">Total count</w:t>
+            </w:r>
+          </w:p>
+          <w:p>
+            <w:pPr>
+              <w:spacing w:after="0" w:before="0"/>
+              <w:jc w:val="left"/>
+            </w:pPr>
+            <w:r>
+              <w:rPr>
+                <w:rFonts w:ascii="Times New Roman" w:cs="Times New Roman" w:eastAsia="Times New Roman" w:hAnsi="Times New Roman"/>
+                <w:b w:val="false"/>
+                <w:bCs w:val="false"/>
+                <w:i w:val="false"/>
+                <w:iCs w:val="false"/>
+                <w:color w:val="000000"/>
+                <w:sz w:val="20"/>
+                <w:szCs w:val="20"/>
+              </w:rPr>
+              <w:t xml:space="preserve">(triples vs rows)</w:t>
             </w:r>
           </w:p>
         </w:tc>
@@ -476,7 +670,147 @@
                 <w:sz w:val="20"/>
                 <w:szCs w:val="20"/>
               </w:rPr>
-              <w:t xml:space="preserve">3.09</w:t>
+              <w:t xml:space="preserve">2.264</w:t>
+            </w:r>
+          </w:p>
+        </w:tc>
+        <w:tc>
+          <w:tcPr>
+            <w:tcBorders>
+              <w:top w:val="none" w:color="FFFFFF" w:sz="0"/>
+              <w:left w:val="none" w:color="FFFFFF" w:sz="0"/>
+              <w:bottom w:val="none" w:color="FFFFFF" w:sz="0"/>
+              <w:right w:val="none" w:color="FFFFFF" w:sz="0"/>
+            </w:tcBorders>
+            <w:tcMar>
+              <w:top w:type="dxa" w:w="80"/>
+              <w:left w:type="dxa" w:w="160"/>
+              <w:bottom w:type="dxa" w:w="80"/>
+              <w:right w:type="dxa" w:w="160"/>
+            </w:tcMar>
+          </w:tcPr>
+          <w:p>
+            <w:pPr>
+              <w:spacing w:after="0" w:before="0"/>
+              <w:jc w:val="right"/>
+            </w:pPr>
+            <w:r>
+              <w:rPr>
+                <w:rFonts w:ascii="Times New Roman" w:cs="Times New Roman" w:eastAsia="Times New Roman" w:hAnsi="Times New Roman"/>
+                <w:b w:val="false"/>
+                <w:bCs w:val="false"/>
+                <w:i w:val="false"/>
+                <w:iCs w:val="false"/>
+                <w:color w:val="000000"/>
+                <w:sz w:val="20"/>
+                <w:szCs w:val="20"/>
+              </w:rPr>
+              <w:t xml:space="preserve">0.015</w:t>
+            </w:r>
+          </w:p>
+        </w:tc>
+        <w:tc>
+          <w:tcPr>
+            <w:tcBorders>
+              <w:top w:val="none" w:color="FFFFFF" w:sz="0"/>
+              <w:left w:val="none" w:color="FFFFFF" w:sz="0"/>
+              <w:bottom w:val="none" w:color="FFFFFF" w:sz="0"/>
+              <w:right w:val="none" w:color="FFFFFF" w:sz="0"/>
+            </w:tcBorders>
+            <w:tcMar>
+              <w:top w:type="dxa" w:w="80"/>
+              <w:left w:type="dxa" w:w="160"/>
+              <w:bottom w:type="dxa" w:w="80"/>
+              <w:right w:type="dxa" w:w="160"/>
+            </w:tcMar>
+          </w:tcPr>
+          <w:p>
+            <w:pPr>
+              <w:spacing w:after="0" w:before="0"/>
+              <w:jc w:val="right"/>
+            </w:pPr>
+            <w:r>
+              <w:rPr>
+                <w:rFonts w:ascii="Times New Roman" w:cs="Times New Roman" w:eastAsia="Times New Roman" w:hAnsi="Times New Roman"/>
+                <w:b w:val="false"/>
+                <w:bCs w:val="false"/>
+                <w:i w:val="false"/>
+                <w:iCs w:val="false"/>
+                <w:color w:val="000000"/>
+                <w:sz w:val="20"/>
+                <w:szCs w:val="20"/>
+              </w:rPr>
+              <w:t xml:space="preserve">0.004</w:t>
+            </w:r>
+          </w:p>
+        </w:tc>
+        <w:tc>
+          <w:tcPr>
+            <w:tcBorders>
+              <w:top w:val="none" w:color="FFFFFF" w:sz="0"/>
+              <w:left w:val="none" w:color="FFFFFF" w:sz="0"/>
+              <w:bottom w:val="none" w:color="FFFFFF" w:sz="0"/>
+              <w:right w:val="none" w:color="FFFFFF" w:sz="0"/>
+            </w:tcBorders>
+            <w:tcMar>
+              <w:top w:type="dxa" w:w="80"/>
+              <w:left w:type="dxa" w:w="160"/>
+              <w:bottom w:type="dxa" w:w="80"/>
+              <w:right w:type="dxa" w:w="160"/>
+            </w:tcMar>
+          </w:tcPr>
+          <w:p>
+            <w:pPr>
+              <w:spacing w:after="0" w:before="0"/>
+              <w:jc w:val="right"/>
+            </w:pPr>
+            <w:r>
+              <w:rPr>
+                <w:rFonts w:ascii="Times New Roman" w:cs="Times New Roman" w:eastAsia="Times New Roman" w:hAnsi="Times New Roman"/>
+                <w:b w:val="false"/>
+                <w:bCs w:val="false"/>
+                <w:i w:val="false"/>
+                <w:iCs w:val="false"/>
+                <w:color w:val="000000"/>
+                <w:sz w:val="20"/>
+                <w:szCs w:val="20"/>
+              </w:rPr>
+              <w:t xml:space="preserve">0.001</w:t>
+            </w:r>
+          </w:p>
+        </w:tc>
+        <w:tc>
+          <w:tcPr>
+            <w:tcBorders>
+              <w:top w:val="none" w:color="FFFFFF" w:sz="0"/>
+              <w:left w:val="none" w:color="FFFFFF" w:sz="0"/>
+              <w:bottom w:val="none" w:color="FFFFFF" w:sz="0"/>
+              <w:right w:val="none" w:color="FFFFFF" w:sz="0"/>
+            </w:tcBorders>
+            <w:tcMar>
+              <w:top w:type="dxa" w:w="80"/>
+              <w:left w:type="dxa" w:w="160"/>
+              <w:bottom w:type="dxa" w:w="80"/>
+              <w:right w:type="dxa" w:w="160"/>
+            </w:tcMar>
+          </w:tcPr>
+          <w:p>
+            <w:pPr>
+              <w:spacing w:after="0" w:before="0"/>
+              <w:jc w:val="right"/>
+            </w:pPr>
+            <w:r>
+              <w:rPr>
+                <w:rFonts w:ascii="Times New Roman" w:cs="Times New Roman" w:eastAsia="Times New Roman" w:hAnsi="Times New Roman"/>
+                <w:b w:val="false"/>
+                <w:bCs w:val="false"/>
+                <w:i w:val="false"/>
+                <w:iCs w:val="false"/>
+                <w:color w:val="000000"/>
+                <w:sz w:val="20"/>
+                <w:szCs w:val="20"/>
+              </w:rPr>
+              <w:t xml:space="preserve">629×</w:t>
             </w:r>
           </w:p>
         </w:tc>
@@ -500,7 +834,7 @@
           <w:p>
             <w:pPr>
               <w:spacing w:after="0" w:before="0"/>
-              <w:jc w:val="left"/>
+              <w:jc w:val="center"/>
             </w:pPr>
             <w:r>
               <w:rPr>
@@ -548,7 +882,26 @@
                 <w:sz w:val="20"/>
                 <w:szCs w:val="20"/>
               </w:rPr>
-              <w:t xml:space="preserve">COUNT of distinct Birth individuals</w:t>
+              <w:t xml:space="preserve">COUNT of distinct</w:t>
+            </w:r>
+          </w:p>
+          <w:p>
+            <w:pPr>
+              <w:spacing w:after="0" w:before="0"/>
+              <w:jc w:val="left"/>
+            </w:pPr>
+            <w:r>
+              <w:rPr>
+                <w:rFonts w:ascii="Times New Roman" w:cs="Times New Roman" w:eastAsia="Times New Roman" w:hAnsi="Times New Roman"/>
+                <w:b w:val="false"/>
+                <w:bCs w:val="false"/>
+                <w:i w:val="false"/>
+                <w:iCs w:val="false"/>
+                <w:color w:val="000000"/>
+                <w:sz w:val="20"/>
+                <w:szCs w:val="20"/>
+              </w:rPr>
+              <w:t xml:space="preserve">Birth individuals</w:t>
             </w:r>
           </w:p>
         </w:tc>
@@ -691,7 +1044,147 @@
                 <w:sz w:val="20"/>
                 <w:szCs w:val="20"/>
               </w:rPr>
-              <w:t xml:space="preserve">7.54</w:t>
+              <w:t xml:space="preserve">0.828</w:t>
+            </w:r>
+          </w:p>
+        </w:tc>
+        <w:tc>
+          <w:tcPr>
+            <w:tcBorders>
+              <w:top w:val="none" w:color="FFFFFF" w:sz="0"/>
+              <w:left w:val="none" w:color="FFFFFF" w:sz="0"/>
+              <w:bottom w:val="none" w:color="FFFFFF" w:sz="0"/>
+              <w:right w:val="none" w:color="FFFFFF" w:sz="0"/>
+            </w:tcBorders>
+            <w:tcMar>
+              <w:top w:type="dxa" w:w="80"/>
+              <w:left w:type="dxa" w:w="160"/>
+              <w:bottom w:type="dxa" w:w="80"/>
+              <w:right w:type="dxa" w:w="160"/>
+            </w:tcMar>
+          </w:tcPr>
+          <w:p>
+            <w:pPr>
+              <w:spacing w:after="0" w:before="0"/>
+              <w:jc w:val="right"/>
+            </w:pPr>
+            <w:r>
+              <w:rPr>
+                <w:rFonts w:ascii="Times New Roman" w:cs="Times New Roman" w:eastAsia="Times New Roman" w:hAnsi="Times New Roman"/>
+                <w:b w:val="false"/>
+                <w:bCs w:val="false"/>
+                <w:i w:val="false"/>
+                <w:iCs w:val="false"/>
+                <w:color w:val="000000"/>
+                <w:sz w:val="20"/>
+                <w:szCs w:val="20"/>
+              </w:rPr>
+              <w:t xml:space="preserve">0.013</w:t>
+            </w:r>
+          </w:p>
+        </w:tc>
+        <w:tc>
+          <w:tcPr>
+            <w:tcBorders>
+              <w:top w:val="none" w:color="FFFFFF" w:sz="0"/>
+              <w:left w:val="none" w:color="FFFFFF" w:sz="0"/>
+              <w:bottom w:val="none" w:color="FFFFFF" w:sz="0"/>
+              <w:right w:val="none" w:color="FFFFFF" w:sz="0"/>
+            </w:tcBorders>
+            <w:tcMar>
+              <w:top w:type="dxa" w:w="80"/>
+              <w:left w:type="dxa" w:w="160"/>
+              <w:bottom w:type="dxa" w:w="80"/>
+              <w:right w:type="dxa" w:w="160"/>
+            </w:tcMar>
+          </w:tcPr>
+          <w:p>
+            <w:pPr>
+              <w:spacing w:after="0" w:before="0"/>
+              <w:jc w:val="right"/>
+            </w:pPr>
+            <w:r>
+              <w:rPr>
+                <w:rFonts w:ascii="Times New Roman" w:cs="Times New Roman" w:eastAsia="Times New Roman" w:hAnsi="Times New Roman"/>
+                <w:b w:val="false"/>
+                <w:bCs w:val="false"/>
+                <w:i w:val="false"/>
+                <w:iCs w:val="false"/>
+                <w:color w:val="000000"/>
+                <w:sz w:val="20"/>
+                <w:szCs w:val="20"/>
+              </w:rPr>
+              <w:t xml:space="preserve">0.004</w:t>
+            </w:r>
+          </w:p>
+        </w:tc>
+        <w:tc>
+          <w:tcPr>
+            <w:tcBorders>
+              <w:top w:val="none" w:color="FFFFFF" w:sz="0"/>
+              <w:left w:val="none" w:color="FFFFFF" w:sz="0"/>
+              <w:bottom w:val="none" w:color="FFFFFF" w:sz="0"/>
+              <w:right w:val="none" w:color="FFFFFF" w:sz="0"/>
+            </w:tcBorders>
+            <w:tcMar>
+              <w:top w:type="dxa" w:w="80"/>
+              <w:left w:type="dxa" w:w="160"/>
+              <w:bottom w:type="dxa" w:w="80"/>
+              <w:right w:type="dxa" w:w="160"/>
+            </w:tcMar>
+          </w:tcPr>
+          <w:p>
+            <w:pPr>
+              <w:spacing w:after="0" w:before="0"/>
+              <w:jc w:val="right"/>
+            </w:pPr>
+            <w:r>
+              <w:rPr>
+                <w:rFonts w:ascii="Times New Roman" w:cs="Times New Roman" w:eastAsia="Times New Roman" w:hAnsi="Times New Roman"/>
+                <w:b w:val="false"/>
+                <w:bCs w:val="false"/>
+                <w:i w:val="false"/>
+                <w:iCs w:val="false"/>
+                <w:color w:val="000000"/>
+                <w:sz w:val="20"/>
+                <w:szCs w:val="20"/>
+              </w:rPr>
+              <w:t xml:space="preserve">&lt;0.001</w:t>
+            </w:r>
+          </w:p>
+        </w:tc>
+        <w:tc>
+          <w:tcPr>
+            <w:tcBorders>
+              <w:top w:val="none" w:color="FFFFFF" w:sz="0"/>
+              <w:left w:val="none" w:color="FFFFFF" w:sz="0"/>
+              <w:bottom w:val="none" w:color="FFFFFF" w:sz="0"/>
+              <w:right w:val="none" w:color="FFFFFF" w:sz="0"/>
+            </w:tcBorders>
+            <w:tcMar>
+              <w:top w:type="dxa" w:w="80"/>
+              <w:left w:type="dxa" w:w="160"/>
+              <w:bottom w:type="dxa" w:w="80"/>
+              <w:right w:type="dxa" w:w="160"/>
+            </w:tcMar>
+          </w:tcPr>
+          <w:p>
+            <w:pPr>
+              <w:spacing w:after="0" w:before="0"/>
+              <w:jc w:val="right"/>
+            </w:pPr>
+            <w:r>
+              <w:rPr>
+                <w:rFonts w:ascii="Times New Roman" w:cs="Times New Roman" w:eastAsia="Times New Roman" w:hAnsi="Times New Roman"/>
+                <w:b w:val="false"/>
+                <w:bCs w:val="false"/>
+                <w:i w:val="false"/>
+                <w:iCs w:val="false"/>
+                <w:color w:val="000000"/>
+                <w:sz w:val="20"/>
+                <w:szCs w:val="20"/>
+              </w:rPr>
+              <w:t xml:space="preserve">224×</w:t>
             </w:r>
           </w:p>
         </w:tc>
@@ -715,7 +1208,7 @@
           <w:p>
             <w:pPr>
               <w:spacing w:after="0" w:before="0"/>
-              <w:jc w:val="left"/>
+              <w:jc w:val="center"/>
             </w:pPr>
             <w:r>
               <w:rPr>
@@ -763,7 +1256,26 @@
                 <w:sz w:val="20"/>
                 <w:szCs w:val="20"/>
               </w:rPr>
-              <w:t xml:space="preserve">COUNT of preterm births (&lt;37 weeks)</w:t>
+              <w:t xml:space="preserve">COUNT of preterm</w:t>
+            </w:r>
+          </w:p>
+          <w:p>
+            <w:pPr>
+              <w:spacing w:after="0" w:before="0"/>
+              <w:jc w:val="left"/>
+            </w:pPr>
+            <w:r>
+              <w:rPr>
+                <w:rFonts w:ascii="Times New Roman" w:cs="Times New Roman" w:eastAsia="Times New Roman" w:hAnsi="Times New Roman"/>
+                <w:b w:val="false"/>
+                <w:bCs w:val="false"/>
+                <w:i w:val="false"/>
+                <w:iCs w:val="false"/>
+                <w:color w:val="000000"/>
+                <w:sz w:val="20"/>
+                <w:szCs w:val="20"/>
+              </w:rPr>
+              <w:t xml:space="preserve">births (&lt;37 weeks)</w:t>
             </w:r>
           </w:p>
         </w:tc>
@@ -906,7 +1418,147 @@
                 <w:sz w:val="20"/>
                 <w:szCs w:val="20"/>
               </w:rPr>
-              <w:t xml:space="preserve">0.16</w:t>
+              <w:t xml:space="preserve">0.106</w:t>
+            </w:r>
+          </w:p>
+        </w:tc>
+        <w:tc>
+          <w:tcPr>
+            <w:tcBorders>
+              <w:top w:val="none" w:color="FFFFFF" w:sz="0"/>
+              <w:left w:val="none" w:color="FFFFFF" w:sz="0"/>
+              <w:bottom w:val="none" w:color="FFFFFF" w:sz="0"/>
+              <w:right w:val="none" w:color="FFFFFF" w:sz="0"/>
+            </w:tcBorders>
+            <w:tcMar>
+              <w:top w:type="dxa" w:w="80"/>
+              <w:left w:type="dxa" w:w="160"/>
+              <w:bottom w:type="dxa" w:w="80"/>
+              <w:right w:type="dxa" w:w="160"/>
+            </w:tcMar>
+          </w:tcPr>
+          <w:p>
+            <w:pPr>
+              <w:spacing w:after="0" w:before="0"/>
+              <w:jc w:val="right"/>
+            </w:pPr>
+            <w:r>
+              <w:rPr>
+                <w:rFonts w:ascii="Times New Roman" w:cs="Times New Roman" w:eastAsia="Times New Roman" w:hAnsi="Times New Roman"/>
+                <w:b w:val="false"/>
+                <w:bCs w:val="false"/>
+                <w:i w:val="false"/>
+                <w:iCs w:val="false"/>
+                <w:color w:val="000000"/>
+                <w:sz w:val="20"/>
+                <w:szCs w:val="20"/>
+              </w:rPr>
+              <w:t xml:space="preserve">0.006</w:t>
+            </w:r>
+          </w:p>
+        </w:tc>
+        <w:tc>
+          <w:tcPr>
+            <w:tcBorders>
+              <w:top w:val="none" w:color="FFFFFF" w:sz="0"/>
+              <w:left w:val="none" w:color="FFFFFF" w:sz="0"/>
+              <w:bottom w:val="none" w:color="FFFFFF" w:sz="0"/>
+              <w:right w:val="none" w:color="FFFFFF" w:sz="0"/>
+            </w:tcBorders>
+            <w:tcMar>
+              <w:top w:type="dxa" w:w="80"/>
+              <w:left w:type="dxa" w:w="160"/>
+              <w:bottom w:type="dxa" w:w="80"/>
+              <w:right w:type="dxa" w:w="160"/>
+            </w:tcMar>
+          </w:tcPr>
+          <w:p>
+            <w:pPr>
+              <w:spacing w:after="0" w:before="0"/>
+              <w:jc w:val="right"/>
+            </w:pPr>
+            <w:r>
+              <w:rPr>
+                <w:rFonts w:ascii="Times New Roman" w:cs="Times New Roman" w:eastAsia="Times New Roman" w:hAnsi="Times New Roman"/>
+                <w:b w:val="false"/>
+                <w:bCs w:val="false"/>
+                <w:i w:val="false"/>
+                <w:iCs w:val="false"/>
+                <w:color w:val="000000"/>
+                <w:sz w:val="20"/>
+                <w:szCs w:val="20"/>
+              </w:rPr>
+              <w:t xml:space="preserve">0.007</w:t>
+            </w:r>
+          </w:p>
+        </w:tc>
+        <w:tc>
+          <w:tcPr>
+            <w:tcBorders>
+              <w:top w:val="none" w:color="FFFFFF" w:sz="0"/>
+              <w:left w:val="none" w:color="FFFFFF" w:sz="0"/>
+              <w:bottom w:val="none" w:color="FFFFFF" w:sz="0"/>
+              <w:right w:val="none" w:color="FFFFFF" w:sz="0"/>
+            </w:tcBorders>
+            <w:tcMar>
+              <w:top w:type="dxa" w:w="80"/>
+              <w:left w:type="dxa" w:w="160"/>
+              <w:bottom w:type="dxa" w:w="80"/>
+              <w:right w:type="dxa" w:w="160"/>
+            </w:tcMar>
+          </w:tcPr>
+          <w:p>
+            <w:pPr>
+              <w:spacing w:after="0" w:before="0"/>
+              <w:jc w:val="right"/>
+            </w:pPr>
+            <w:r>
+              <w:rPr>
+                <w:rFonts w:ascii="Times New Roman" w:cs="Times New Roman" w:eastAsia="Times New Roman" w:hAnsi="Times New Roman"/>
+                <w:b w:val="false"/>
+                <w:bCs w:val="false"/>
+                <w:i w:val="false"/>
+                <w:iCs w:val="false"/>
+                <w:color w:val="000000"/>
+                <w:sz w:val="20"/>
+                <w:szCs w:val="20"/>
+              </w:rPr>
+              <w:t xml:space="preserve">0.001</w:t>
+            </w:r>
+          </w:p>
+        </w:tc>
+        <w:tc>
+          <w:tcPr>
+            <w:tcBorders>
+              <w:top w:val="none" w:color="FFFFFF" w:sz="0"/>
+              <w:left w:val="none" w:color="FFFFFF" w:sz="0"/>
+              <w:bottom w:val="none" w:color="FFFFFF" w:sz="0"/>
+              <w:right w:val="none" w:color="FFFFFF" w:sz="0"/>
+            </w:tcBorders>
+            <w:tcMar>
+              <w:top w:type="dxa" w:w="80"/>
+              <w:left w:type="dxa" w:w="160"/>
+              <w:bottom w:type="dxa" w:w="80"/>
+              <w:right w:type="dxa" w:w="160"/>
+            </w:tcMar>
+          </w:tcPr>
+          <w:p>
+            <w:pPr>
+              <w:spacing w:after="0" w:before="0"/>
+              <w:jc w:val="right"/>
+            </w:pPr>
+            <w:r>
+              <w:rPr>
+                <w:rFonts w:ascii="Times New Roman" w:cs="Times New Roman" w:eastAsia="Times New Roman" w:hAnsi="Times New Roman"/>
+                <w:b w:val="false"/>
+                <w:bCs w:val="false"/>
+                <w:i w:val="false"/>
+                <w:iCs w:val="false"/>
+                <w:color w:val="000000"/>
+                <w:sz w:val="20"/>
+                <w:szCs w:val="20"/>
+              </w:rPr>
+              <w:t xml:space="preserve">16×</w:t>
             </w:r>
           </w:p>
         </w:tc>
@@ -930,7 +1582,7 @@
           <w:p>
             <w:pPr>
               <w:spacing w:after="0" w:before="0"/>
-              <w:jc w:val="left"/>
+              <w:jc w:val="center"/>
             </w:pPr>
             <w:r>
               <w:rPr>
@@ -978,7 +1630,26 @@
                 <w:sz w:val="20"/>
                 <w:szCs w:val="20"/>
               </w:rPr>
-              <w:t xml:space="preserve">COUNT of term births (37–41 weeks)</w:t>
+              <w:t xml:space="preserve">COUNT of term births</w:t>
+            </w:r>
+          </w:p>
+          <w:p>
+            <w:pPr>
+              <w:spacing w:after="0" w:before="0"/>
+              <w:jc w:val="left"/>
+            </w:pPr>
+            <w:r>
+              <w:rPr>
+                <w:rFonts w:ascii="Times New Roman" w:cs="Times New Roman" w:eastAsia="Times New Roman" w:hAnsi="Times New Roman"/>
+                <w:b w:val="false"/>
+                <w:bCs w:val="false"/>
+                <w:i w:val="false"/>
+                <w:iCs w:val="false"/>
+                <w:color w:val="000000"/>
+                <w:sz w:val="20"/>
+                <w:szCs w:val="20"/>
+              </w:rPr>
+              <w:t xml:space="preserve">(37–41 weeks)</w:t>
             </w:r>
           </w:p>
         </w:tc>
@@ -1121,7 +1792,147 @@
                 <w:sz w:val="20"/>
                 <w:szCs w:val="20"/>
               </w:rPr>
-              <w:t xml:space="preserve">0.85</w:t>
+              <w:t xml:space="preserve">0.803</w:t>
+            </w:r>
+          </w:p>
+        </w:tc>
+        <w:tc>
+          <w:tcPr>
+            <w:tcBorders>
+              <w:top w:val="none" w:color="FFFFFF" w:sz="0"/>
+              <w:left w:val="none" w:color="FFFFFF" w:sz="0"/>
+              <w:bottom w:val="none" w:color="FFFFFF" w:sz="0"/>
+              <w:right w:val="none" w:color="FFFFFF" w:sz="0"/>
+            </w:tcBorders>
+            <w:tcMar>
+              <w:top w:type="dxa" w:w="80"/>
+              <w:left w:type="dxa" w:w="160"/>
+              <w:bottom w:type="dxa" w:w="80"/>
+              <w:right w:type="dxa" w:w="160"/>
+            </w:tcMar>
+          </w:tcPr>
+          <w:p>
+            <w:pPr>
+              <w:spacing w:after="0" w:before="0"/>
+              <w:jc w:val="right"/>
+            </w:pPr>
+            <w:r>
+              <w:rPr>
+                <w:rFonts w:ascii="Times New Roman" w:cs="Times New Roman" w:eastAsia="Times New Roman" w:hAnsi="Times New Roman"/>
+                <w:b w:val="false"/>
+                <w:bCs w:val="false"/>
+                <w:i w:val="false"/>
+                <w:iCs w:val="false"/>
+                <w:color w:val="000000"/>
+                <w:sz w:val="20"/>
+                <w:szCs w:val="20"/>
+              </w:rPr>
+              <w:t xml:space="preserve">0.010</w:t>
+            </w:r>
+          </w:p>
+        </w:tc>
+        <w:tc>
+          <w:tcPr>
+            <w:tcBorders>
+              <w:top w:val="none" w:color="FFFFFF" w:sz="0"/>
+              <w:left w:val="none" w:color="FFFFFF" w:sz="0"/>
+              <w:bottom w:val="none" w:color="FFFFFF" w:sz="0"/>
+              <w:right w:val="none" w:color="FFFFFF" w:sz="0"/>
+            </w:tcBorders>
+            <w:tcMar>
+              <w:top w:type="dxa" w:w="80"/>
+              <w:left w:type="dxa" w:w="160"/>
+              <w:bottom w:type="dxa" w:w="80"/>
+              <w:right w:type="dxa" w:w="160"/>
+            </w:tcMar>
+          </w:tcPr>
+          <w:p>
+            <w:pPr>
+              <w:spacing w:after="0" w:before="0"/>
+              <w:jc w:val="right"/>
+            </w:pPr>
+            <w:r>
+              <w:rPr>
+                <w:rFonts w:ascii="Times New Roman" w:cs="Times New Roman" w:eastAsia="Times New Roman" w:hAnsi="Times New Roman"/>
+                <w:b w:val="false"/>
+                <w:bCs w:val="false"/>
+                <w:i w:val="false"/>
+                <w:iCs w:val="false"/>
+                <w:color w:val="000000"/>
+                <w:sz w:val="20"/>
+                <w:szCs w:val="20"/>
+              </w:rPr>
+              <w:t xml:space="preserve">0.008</w:t>
+            </w:r>
+          </w:p>
+        </w:tc>
+        <w:tc>
+          <w:tcPr>
+            <w:tcBorders>
+              <w:top w:val="none" w:color="FFFFFF" w:sz="0"/>
+              <w:left w:val="none" w:color="FFFFFF" w:sz="0"/>
+              <w:bottom w:val="none" w:color="FFFFFF" w:sz="0"/>
+              <w:right w:val="none" w:color="FFFFFF" w:sz="0"/>
+            </w:tcBorders>
+            <w:tcMar>
+              <w:top w:type="dxa" w:w="80"/>
+              <w:left w:type="dxa" w:w="160"/>
+              <w:bottom w:type="dxa" w:w="80"/>
+              <w:right w:type="dxa" w:w="160"/>
+            </w:tcMar>
+          </w:tcPr>
+          <w:p>
+            <w:pPr>
+              <w:spacing w:after="0" w:before="0"/>
+              <w:jc w:val="right"/>
+            </w:pPr>
+            <w:r>
+              <w:rPr>
+                <w:rFonts w:ascii="Times New Roman" w:cs="Times New Roman" w:eastAsia="Times New Roman" w:hAnsi="Times New Roman"/>
+                <w:b w:val="false"/>
+                <w:bCs w:val="false"/>
+                <w:i w:val="false"/>
+                <w:iCs w:val="false"/>
+                <w:color w:val="000000"/>
+                <w:sz w:val="20"/>
+                <w:szCs w:val="20"/>
+              </w:rPr>
+              <w:t xml:space="preserve">0.001</w:t>
+            </w:r>
+          </w:p>
+        </w:tc>
+        <w:tc>
+          <w:tcPr>
+            <w:tcBorders>
+              <w:top w:val="none" w:color="FFFFFF" w:sz="0"/>
+              <w:left w:val="none" w:color="FFFFFF" w:sz="0"/>
+              <w:bottom w:val="none" w:color="FFFFFF" w:sz="0"/>
+              <w:right w:val="none" w:color="FFFFFF" w:sz="0"/>
+            </w:tcBorders>
+            <w:tcMar>
+              <w:top w:type="dxa" w:w="80"/>
+              <w:left w:type="dxa" w:w="160"/>
+              <w:bottom w:type="dxa" w:w="80"/>
+              <w:right w:type="dxa" w:w="160"/>
+            </w:tcMar>
+          </w:tcPr>
+          <w:p>
+            <w:pPr>
+              <w:spacing w:after="0" w:before="0"/>
+              <w:jc w:val="right"/>
+            </w:pPr>
+            <w:r>
+              <w:rPr>
+                <w:rFonts w:ascii="Times New Roman" w:cs="Times New Roman" w:eastAsia="Times New Roman" w:hAnsi="Times New Roman"/>
+                <w:b w:val="false"/>
+                <w:bCs w:val="false"/>
+                <w:i w:val="false"/>
+                <w:iCs w:val="false"/>
+                <w:color w:val="000000"/>
+                <w:sz w:val="20"/>
+                <w:szCs w:val="20"/>
+              </w:rPr>
+              <w:t xml:space="preserve">97×</w:t>
             </w:r>
           </w:p>
         </w:tc>
@@ -1145,7 +1956,7 @@
           <w:p>
             <w:pPr>
               <w:spacing w:after="0" w:before="0"/>
-              <w:jc w:val="left"/>
+              <w:jc w:val="center"/>
             </w:pPr>
             <w:r>
               <w:rPr>
@@ -1193,7 +2004,26 @@
                 <w:sz w:val="20"/>
                 <w:szCs w:val="20"/>
               </w:rPr>
-              <w:t xml:space="preserve">COUNT of post-term births (≥42 weeks)</w:t>
+              <w:t xml:space="preserve">COUNT of post-term</w:t>
+            </w:r>
+          </w:p>
+          <w:p>
+            <w:pPr>
+              <w:spacing w:after="0" w:before="0"/>
+              <w:jc w:val="left"/>
+            </w:pPr>
+            <w:r>
+              <w:rPr>
+                <w:rFonts w:ascii="Times New Roman" w:cs="Times New Roman" w:eastAsia="Times New Roman" w:hAnsi="Times New Roman"/>
+                <w:b w:val="false"/>
+                <w:bCs w:val="false"/>
+                <w:i w:val="false"/>
+                <w:iCs w:val="false"/>
+                <w:color w:val="000000"/>
+                <w:sz w:val="20"/>
+                <w:szCs w:val="20"/>
+              </w:rPr>
+              <w:t xml:space="preserve">births (≥42 weeks)</w:t>
             </w:r>
           </w:p>
         </w:tc>
@@ -1336,7 +2166,147 @@
                 <w:sz w:val="20"/>
                 <w:szCs w:val="20"/>
               </w:rPr>
-              <w:t xml:space="preserve">0.03</w:t>
+              <w:t xml:space="preserve">0.026</w:t>
+            </w:r>
+          </w:p>
+        </w:tc>
+        <w:tc>
+          <w:tcPr>
+            <w:tcBorders>
+              <w:top w:val="none" w:color="FFFFFF" w:sz="0"/>
+              <w:left w:val="none" w:color="FFFFFF" w:sz="0"/>
+              <w:bottom w:val="none" w:color="FFFFFF" w:sz="0"/>
+              <w:right w:val="none" w:color="FFFFFF" w:sz="0"/>
+            </w:tcBorders>
+            <w:tcMar>
+              <w:top w:type="dxa" w:w="80"/>
+              <w:left w:type="dxa" w:w="160"/>
+              <w:bottom w:type="dxa" w:w="80"/>
+              <w:right w:type="dxa" w:w="160"/>
+            </w:tcMar>
+          </w:tcPr>
+          <w:p>
+            <w:pPr>
+              <w:spacing w:after="0" w:before="0"/>
+              <w:jc w:val="right"/>
+            </w:pPr>
+            <w:r>
+              <w:rPr>
+                <w:rFonts w:ascii="Times New Roman" w:cs="Times New Roman" w:eastAsia="Times New Roman" w:hAnsi="Times New Roman"/>
+                <w:b w:val="false"/>
+                <w:bCs w:val="false"/>
+                <w:i w:val="false"/>
+                <w:iCs w:val="false"/>
+                <w:color w:val="000000"/>
+                <w:sz w:val="20"/>
+                <w:szCs w:val="20"/>
+              </w:rPr>
+              <w:t xml:space="preserve">&lt;0.001</w:t>
+            </w:r>
+          </w:p>
+        </w:tc>
+        <w:tc>
+          <w:tcPr>
+            <w:tcBorders>
+              <w:top w:val="none" w:color="FFFFFF" w:sz="0"/>
+              <w:left w:val="none" w:color="FFFFFF" w:sz="0"/>
+              <w:bottom w:val="none" w:color="FFFFFF" w:sz="0"/>
+              <w:right w:val="none" w:color="FFFFFF" w:sz="0"/>
+            </w:tcBorders>
+            <w:tcMar>
+              <w:top w:type="dxa" w:w="80"/>
+              <w:left w:type="dxa" w:w="160"/>
+              <w:bottom w:type="dxa" w:w="80"/>
+              <w:right w:type="dxa" w:w="160"/>
+            </w:tcMar>
+          </w:tcPr>
+          <w:p>
+            <w:pPr>
+              <w:spacing w:after="0" w:before="0"/>
+              <w:jc w:val="right"/>
+            </w:pPr>
+            <w:r>
+              <w:rPr>
+                <w:rFonts w:ascii="Times New Roman" w:cs="Times New Roman" w:eastAsia="Times New Roman" w:hAnsi="Times New Roman"/>
+                <w:b w:val="false"/>
+                <w:bCs w:val="false"/>
+                <w:i w:val="false"/>
+                <w:iCs w:val="false"/>
+                <w:color w:val="000000"/>
+                <w:sz w:val="20"/>
+                <w:szCs w:val="20"/>
+              </w:rPr>
+              <w:t xml:space="preserve">0.007</w:t>
+            </w:r>
+          </w:p>
+        </w:tc>
+        <w:tc>
+          <w:tcPr>
+            <w:tcBorders>
+              <w:top w:val="none" w:color="FFFFFF" w:sz="0"/>
+              <w:left w:val="none" w:color="FFFFFF" w:sz="0"/>
+              <w:bottom w:val="none" w:color="FFFFFF" w:sz="0"/>
+              <w:right w:val="none" w:color="FFFFFF" w:sz="0"/>
+            </w:tcBorders>
+            <w:tcMar>
+              <w:top w:type="dxa" w:w="80"/>
+              <w:left w:type="dxa" w:w="160"/>
+              <w:bottom w:type="dxa" w:w="80"/>
+              <w:right w:type="dxa" w:w="160"/>
+            </w:tcMar>
+          </w:tcPr>
+          <w:p>
+            <w:pPr>
+              <w:spacing w:after="0" w:before="0"/>
+              <w:jc w:val="right"/>
+            </w:pPr>
+            <w:r>
+              <w:rPr>
+                <w:rFonts w:ascii="Times New Roman" w:cs="Times New Roman" w:eastAsia="Times New Roman" w:hAnsi="Times New Roman"/>
+                <w:b w:val="false"/>
+                <w:bCs w:val="false"/>
+                <w:i w:val="false"/>
+                <w:iCs w:val="false"/>
+                <w:color w:val="000000"/>
+                <w:sz w:val="20"/>
+                <w:szCs w:val="20"/>
+              </w:rPr>
+              <w:t xml:space="preserve">0.001</w:t>
+            </w:r>
+          </w:p>
+        </w:tc>
+        <w:tc>
+          <w:tcPr>
+            <w:tcBorders>
+              <w:top w:val="none" w:color="FFFFFF" w:sz="0"/>
+              <w:left w:val="none" w:color="FFFFFF" w:sz="0"/>
+              <w:bottom w:val="none" w:color="FFFFFF" w:sz="0"/>
+              <w:right w:val="none" w:color="FFFFFF" w:sz="0"/>
+            </w:tcBorders>
+            <w:tcMar>
+              <w:top w:type="dxa" w:w="80"/>
+              <w:left w:type="dxa" w:w="160"/>
+              <w:bottom w:type="dxa" w:w="80"/>
+              <w:right w:type="dxa" w:w="160"/>
+            </w:tcMar>
+          </w:tcPr>
+          <w:p>
+            <w:pPr>
+              <w:spacing w:after="0" w:before="0"/>
+              <w:jc w:val="right"/>
+            </w:pPr>
+            <w:r>
+              <w:rPr>
+                <w:rFonts w:ascii="Times New Roman" w:cs="Times New Roman" w:eastAsia="Times New Roman" w:hAnsi="Times New Roman"/>
+                <w:b w:val="false"/>
+                <w:bCs w:val="false"/>
+                <w:i w:val="false"/>
+                <w:iCs w:val="false"/>
+                <w:color w:val="000000"/>
+                <w:sz w:val="20"/>
+                <w:szCs w:val="20"/>
+              </w:rPr>
+              <w:t xml:space="preserve">4×</w:t>
             </w:r>
           </w:p>
         </w:tc>
@@ -1360,7 +2330,7 @@
           <w:p>
             <w:pPr>
               <w:spacing w:after="0" w:before="0"/>
-              <w:jc w:val="left"/>
+              <w:jc w:val="center"/>
             </w:pPr>
             <w:r>
               <w:rPr>
@@ -1408,7 +2378,26 @@
                 <w:sz w:val="20"/>
                 <w:szCs w:val="20"/>
               </w:rPr>
-              <w:t xml:space="preserve">COUNT of low birth weight births (&lt;2,500 g)</w:t>
+              <w:t xml:space="preserve">COUNT of low birth</w:t>
+            </w:r>
+          </w:p>
+          <w:p>
+            <w:pPr>
+              <w:spacing w:after="0" w:before="0"/>
+              <w:jc w:val="left"/>
+            </w:pPr>
+            <w:r>
+              <w:rPr>
+                <w:rFonts w:ascii="Times New Roman" w:cs="Times New Roman" w:eastAsia="Times New Roman" w:hAnsi="Times New Roman"/>
+                <w:b w:val="false"/>
+                <w:bCs w:val="false"/>
+                <w:i w:val="false"/>
+                <w:iCs w:val="false"/>
+                <w:color w:val="000000"/>
+                <w:sz w:val="20"/>
+                <w:szCs w:val="20"/>
+              </w:rPr>
+              <w:t xml:space="preserve">weight (&lt;2,500 g)</w:t>
             </w:r>
           </w:p>
         </w:tc>
@@ -1551,7 +2540,147 @@
                 <w:sz w:val="20"/>
                 <w:szCs w:val="20"/>
               </w:rPr>
-              <w:t xml:space="preserve">0.11</w:t>
+              <w:t xml:space="preserve">0.095</w:t>
+            </w:r>
+          </w:p>
+        </w:tc>
+        <w:tc>
+          <w:tcPr>
+            <w:tcBorders>
+              <w:top w:val="none" w:color="FFFFFF" w:sz="0"/>
+              <w:left w:val="none" w:color="FFFFFF" w:sz="0"/>
+              <w:bottom w:val="none" w:color="FFFFFF" w:sz="0"/>
+              <w:right w:val="none" w:color="FFFFFF" w:sz="0"/>
+            </w:tcBorders>
+            <w:tcMar>
+              <w:top w:type="dxa" w:w="80"/>
+              <w:left w:type="dxa" w:w="160"/>
+              <w:bottom w:type="dxa" w:w="80"/>
+              <w:right w:type="dxa" w:w="160"/>
+            </w:tcMar>
+          </w:tcPr>
+          <w:p>
+            <w:pPr>
+              <w:spacing w:after="0" w:before="0"/>
+              <w:jc w:val="right"/>
+            </w:pPr>
+            <w:r>
+              <w:rPr>
+                <w:rFonts w:ascii="Times New Roman" w:cs="Times New Roman" w:eastAsia="Times New Roman" w:hAnsi="Times New Roman"/>
+                <w:b w:val="false"/>
+                <w:bCs w:val="false"/>
+                <w:i w:val="false"/>
+                <w:iCs w:val="false"/>
+                <w:color w:val="000000"/>
+                <w:sz w:val="20"/>
+                <w:szCs w:val="20"/>
+              </w:rPr>
+              <w:t xml:space="preserve">0.005</w:t>
+            </w:r>
+          </w:p>
+        </w:tc>
+        <w:tc>
+          <w:tcPr>
+            <w:tcBorders>
+              <w:top w:val="none" w:color="FFFFFF" w:sz="0"/>
+              <w:left w:val="none" w:color="FFFFFF" w:sz="0"/>
+              <w:bottom w:val="none" w:color="FFFFFF" w:sz="0"/>
+              <w:right w:val="none" w:color="FFFFFF" w:sz="0"/>
+            </w:tcBorders>
+            <w:tcMar>
+              <w:top w:type="dxa" w:w="80"/>
+              <w:left w:type="dxa" w:w="160"/>
+              <w:bottom w:type="dxa" w:w="80"/>
+              <w:right w:type="dxa" w:w="160"/>
+            </w:tcMar>
+          </w:tcPr>
+          <w:p>
+            <w:pPr>
+              <w:spacing w:after="0" w:before="0"/>
+              <w:jc w:val="right"/>
+            </w:pPr>
+            <w:r>
+              <w:rPr>
+                <w:rFonts w:ascii="Times New Roman" w:cs="Times New Roman" w:eastAsia="Times New Roman" w:hAnsi="Times New Roman"/>
+                <w:b w:val="false"/>
+                <w:bCs w:val="false"/>
+                <w:i w:val="false"/>
+                <w:iCs w:val="false"/>
+                <w:color w:val="000000"/>
+                <w:sz w:val="20"/>
+                <w:szCs w:val="20"/>
+              </w:rPr>
+              <w:t xml:space="preserve">0.007</w:t>
+            </w:r>
+          </w:p>
+        </w:tc>
+        <w:tc>
+          <w:tcPr>
+            <w:tcBorders>
+              <w:top w:val="none" w:color="FFFFFF" w:sz="0"/>
+              <w:left w:val="none" w:color="FFFFFF" w:sz="0"/>
+              <w:bottom w:val="none" w:color="FFFFFF" w:sz="0"/>
+              <w:right w:val="none" w:color="FFFFFF" w:sz="0"/>
+            </w:tcBorders>
+            <w:tcMar>
+              <w:top w:type="dxa" w:w="80"/>
+              <w:left w:type="dxa" w:w="160"/>
+              <w:bottom w:type="dxa" w:w="80"/>
+              <w:right w:type="dxa" w:w="160"/>
+            </w:tcMar>
+          </w:tcPr>
+          <w:p>
+            <w:pPr>
+              <w:spacing w:after="0" w:before="0"/>
+              <w:jc w:val="right"/>
+            </w:pPr>
+            <w:r>
+              <w:rPr>
+                <w:rFonts w:ascii="Times New Roman" w:cs="Times New Roman" w:eastAsia="Times New Roman" w:hAnsi="Times New Roman"/>
+                <w:b w:val="false"/>
+                <w:bCs w:val="false"/>
+                <w:i w:val="false"/>
+                <w:iCs w:val="false"/>
+                <w:color w:val="000000"/>
+                <w:sz w:val="20"/>
+                <w:szCs w:val="20"/>
+              </w:rPr>
+              <w:t xml:space="preserve">0.001</w:t>
+            </w:r>
+          </w:p>
+        </w:tc>
+        <w:tc>
+          <w:tcPr>
+            <w:tcBorders>
+              <w:top w:val="none" w:color="FFFFFF" w:sz="0"/>
+              <w:left w:val="none" w:color="FFFFFF" w:sz="0"/>
+              <w:bottom w:val="none" w:color="FFFFFF" w:sz="0"/>
+              <w:right w:val="none" w:color="FFFFFF" w:sz="0"/>
+            </w:tcBorders>
+            <w:tcMar>
+              <w:top w:type="dxa" w:w="80"/>
+              <w:left w:type="dxa" w:w="160"/>
+              <w:bottom w:type="dxa" w:w="80"/>
+              <w:right w:type="dxa" w:w="160"/>
+            </w:tcMar>
+          </w:tcPr>
+          <w:p>
+            <w:pPr>
+              <w:spacing w:after="0" w:before="0"/>
+              <w:jc w:val="right"/>
+            </w:pPr>
+            <w:r>
+              <w:rPr>
+                <w:rFonts w:ascii="Times New Roman" w:cs="Times New Roman" w:eastAsia="Times New Roman" w:hAnsi="Times New Roman"/>
+                <w:b w:val="false"/>
+                <w:bCs w:val="false"/>
+                <w:i w:val="false"/>
+                <w:iCs w:val="false"/>
+                <w:color w:val="000000"/>
+                <w:sz w:val="20"/>
+                <w:szCs w:val="20"/>
+              </w:rPr>
+              <w:t xml:space="preserve">13×</w:t>
             </w:r>
           </w:p>
         </w:tc>
@@ -1575,7 +2704,7 @@
           <w:p>
             <w:pPr>
               <w:spacing w:after="0" w:before="0"/>
-              <w:jc w:val="left"/>
+              <w:jc w:val="center"/>
             </w:pPr>
             <w:r>
               <w:rPr>
@@ -1623,7 +2752,7 @@
                 <w:sz w:val="20"/>
                 <w:szCs w:val="20"/>
               </w:rPr>
-              <w:t xml:space="preserve">COUNT of births with extreme heat</w:t>
+              <w:t xml:space="preserve">COUNT of extreme heat</w:t>
             </w:r>
           </w:p>
           <w:p>
@@ -1642,7 +2771,7 @@
                 <w:sz w:val="20"/>
                 <w:szCs w:val="20"/>
               </w:rPr>
-              <w:t xml:space="preserve">exposure during third trimester†</w:t>
+              <w:t xml:space="preserve">exposure during T3†</w:t>
             </w:r>
           </w:p>
         </w:tc>
@@ -1785,7 +2914,147 @@
                 <w:sz w:val="20"/>
                 <w:szCs w:val="20"/>
               </w:rPr>
-              <w:t xml:space="preserve">3.37</w:t>
+              <w:t xml:space="preserve">1.898‡</w:t>
+            </w:r>
+          </w:p>
+        </w:tc>
+        <w:tc>
+          <w:tcPr>
+            <w:tcBorders>
+              <w:top w:val="none" w:color="FFFFFF" w:sz="0"/>
+              <w:left w:val="none" w:color="FFFFFF" w:sz="0"/>
+              <w:bottom w:val="none" w:color="FFFFFF" w:sz="0"/>
+              <w:right w:val="none" w:color="FFFFFF" w:sz="0"/>
+            </w:tcBorders>
+            <w:tcMar>
+              <w:top w:type="dxa" w:w="80"/>
+              <w:left w:type="dxa" w:w="160"/>
+              <w:bottom w:type="dxa" w:w="80"/>
+              <w:right w:type="dxa" w:w="160"/>
+            </w:tcMar>
+          </w:tcPr>
+          <w:p>
+            <w:pPr>
+              <w:spacing w:after="0" w:before="0"/>
+              <w:jc w:val="right"/>
+            </w:pPr>
+            <w:r>
+              <w:rPr>
+                <w:rFonts w:ascii="Times New Roman" w:cs="Times New Roman" w:eastAsia="Times New Roman" w:hAnsi="Times New Roman"/>
+                <w:b w:val="false"/>
+                <w:bCs w:val="false"/>
+                <w:i w:val="false"/>
+                <w:iCs w:val="false"/>
+                <w:color w:val="000000"/>
+                <w:sz w:val="20"/>
+                <w:szCs w:val="20"/>
+              </w:rPr>
+              <w:t xml:space="preserve">0.793</w:t>
+            </w:r>
+          </w:p>
+        </w:tc>
+        <w:tc>
+          <w:tcPr>
+            <w:tcBorders>
+              <w:top w:val="none" w:color="FFFFFF" w:sz="0"/>
+              <w:left w:val="none" w:color="FFFFFF" w:sz="0"/>
+              <w:bottom w:val="none" w:color="FFFFFF" w:sz="0"/>
+              <w:right w:val="none" w:color="FFFFFF" w:sz="0"/>
+            </w:tcBorders>
+            <w:tcMar>
+              <w:top w:type="dxa" w:w="80"/>
+              <w:left w:type="dxa" w:w="160"/>
+              <w:bottom w:type="dxa" w:w="80"/>
+              <w:right w:type="dxa" w:w="160"/>
+            </w:tcMar>
+          </w:tcPr>
+          <w:p>
+            <w:pPr>
+              <w:spacing w:after="0" w:before="0"/>
+              <w:jc w:val="right"/>
+            </w:pPr>
+            <w:r>
+              <w:rPr>
+                <w:rFonts w:ascii="Times New Roman" w:cs="Times New Roman" w:eastAsia="Times New Roman" w:hAnsi="Times New Roman"/>
+                <w:b w:val="false"/>
+                <w:bCs w:val="false"/>
+                <w:i w:val="false"/>
+                <w:iCs w:val="false"/>
+                <w:color w:val="000000"/>
+                <w:sz w:val="20"/>
+                <w:szCs w:val="20"/>
+              </w:rPr>
+              <w:t xml:space="preserve">0.004</w:t>
+            </w:r>
+          </w:p>
+        </w:tc>
+        <w:tc>
+          <w:tcPr>
+            <w:tcBorders>
+              <w:top w:val="none" w:color="FFFFFF" w:sz="0"/>
+              <w:left w:val="none" w:color="FFFFFF" w:sz="0"/>
+              <w:bottom w:val="none" w:color="FFFFFF" w:sz="0"/>
+              <w:right w:val="none" w:color="FFFFFF" w:sz="0"/>
+            </w:tcBorders>
+            <w:tcMar>
+              <w:top w:type="dxa" w:w="80"/>
+              <w:left w:type="dxa" w:w="160"/>
+              <w:bottom w:type="dxa" w:w="80"/>
+              <w:right w:type="dxa" w:w="160"/>
+            </w:tcMar>
+          </w:tcPr>
+          <w:p>
+            <w:pPr>
+              <w:spacing w:after="0" w:before="0"/>
+              <w:jc w:val="right"/>
+            </w:pPr>
+            <w:r>
+              <w:rPr>
+                <w:rFonts w:ascii="Times New Roman" w:cs="Times New Roman" w:eastAsia="Times New Roman" w:hAnsi="Times New Roman"/>
+                <w:b w:val="false"/>
+                <w:bCs w:val="false"/>
+                <w:i w:val="false"/>
+                <w:iCs w:val="false"/>
+                <w:color w:val="000000"/>
+                <w:sz w:val="20"/>
+                <w:szCs w:val="20"/>
+              </w:rPr>
+              <w:t xml:space="preserve">&lt;0.001</w:t>
+            </w:r>
+          </w:p>
+        </w:tc>
+        <w:tc>
+          <w:tcPr>
+            <w:tcBorders>
+              <w:top w:val="none" w:color="FFFFFF" w:sz="0"/>
+              <w:left w:val="none" w:color="FFFFFF" w:sz="0"/>
+              <w:bottom w:val="none" w:color="FFFFFF" w:sz="0"/>
+              <w:right w:val="none" w:color="FFFFFF" w:sz="0"/>
+            </w:tcBorders>
+            <w:tcMar>
+              <w:top w:type="dxa" w:w="80"/>
+              <w:left w:type="dxa" w:w="160"/>
+              <w:bottom w:type="dxa" w:w="80"/>
+              <w:right w:type="dxa" w:w="160"/>
+            </w:tcMar>
+          </w:tcPr>
+          <w:p>
+            <w:pPr>
+              <w:spacing w:after="0" w:before="0"/>
+              <w:jc w:val="right"/>
+            </w:pPr>
+            <w:r>
+              <w:rPr>
+                <w:rFonts w:ascii="Times New Roman" w:cs="Times New Roman" w:eastAsia="Times New Roman" w:hAnsi="Times New Roman"/>
+                <w:b w:val="false"/>
+                <w:bCs w:val="false"/>
+                <w:i w:val="false"/>
+                <w:iCs w:val="false"/>
+                <w:color w:val="000000"/>
+                <w:sz w:val="20"/>
+                <w:szCs w:val="20"/>
+              </w:rPr>
+              <w:t xml:space="preserve">463×</w:t>
             </w:r>
           </w:p>
         </w:tc>
@@ -1809,7 +3078,7 @@
           <w:p>
             <w:pPr>
               <w:spacing w:after="0" w:before="0"/>
-              <w:jc w:val="left"/>
+              <w:jc w:val="center"/>
             </w:pPr>
             <w:r>
               <w:rPr>
@@ -1857,7 +3126,7 @@
                 <w:sz w:val="20"/>
                 <w:szCs w:val="20"/>
               </w:rPr>
-              <w:t xml:space="preserve">Multidimensional JOIN — preterm births</w:t>
+              <w:t xml:space="preserve">AVG birth weight</w:t>
             </w:r>
           </w:p>
           <w:p>
@@ -1876,26 +3145,7 @@
                 <w:sz w:val="20"/>
                 <w:szCs w:val="20"/>
               </w:rPr>
-              <w:t xml:space="preserve">with extreme heat exposure in T3,</w:t>
-            </w:r>
-          </w:p>
-          <w:p>
-            <w:pPr>
-              <w:spacing w:after="0" w:before="0"/>
-              <w:jc w:val="left"/>
-            </w:pPr>
-            <w:r>
-              <w:rPr>
-                <w:rFonts w:ascii="Times New Roman" w:cs="Times New Roman" w:eastAsia="Times New Roman" w:hAnsi="Times New Roman"/>
-                <w:b w:val="false"/>
-                <w:bCs w:val="false"/>
-                <w:i w:val="false"/>
-                <w:iCs w:val="false"/>
-                <w:color w:val="000000"/>
-                <w:sz w:val="20"/>
-                <w:szCs w:val="20"/>
-              </w:rPr>
-              <w:t xml:space="preserve">counts aggregated by municipality‡</w:t>
+              <w:t xml:space="preserve">across all births</w:t>
             </w:r>
           </w:p>
         </w:tc>
@@ -1930,7 +3180,7 @@
                 <w:sz w:val="17"/>
                 <w:szCs w:val="17"/>
               </w:rPr>
-              <w:t xml:space="preserve">SELECT ?municipality</w:t>
+              <w:t xml:space="preserve">SELECT (AVG(?w) AS ?mean)</w:t>
             </w:r>
           </w:p>
           <w:p>
@@ -1949,7 +3199,7 @@
                 <w:sz w:val="17"/>
                 <w:szCs w:val="17"/>
               </w:rPr>
-              <w:t xml:space="preserve">  (COUNT(?b) AS ?n_preterm_heat)</w:t>
+              <w:t xml:space="preserve">WHERE {</w:t>
             </w:r>
           </w:p>
           <w:p>
@@ -1968,140 +3218,7 @@
                 <w:sz w:val="17"/>
                 <w:szCs w:val="17"/>
               </w:rPr>
-              <w:t xml:space="preserve">WHERE {</w:t>
-            </w:r>
-          </w:p>
-          <w:p>
-            <w:pPr>
-              <w:spacing w:after="0" w:before="0"/>
-              <w:jc w:val="left"/>
-            </w:pPr>
-            <w:r>
-              <w:rPr>
-                <w:rFonts w:ascii="Courier New" w:cs="Courier New" w:eastAsia="Courier New" w:hAnsi="Courier New"/>
-                <w:b w:val="false"/>
-                <w:bCs w:val="false"/>
-                <w:i w:val="false"/>
-                <w:iCs w:val="false"/>
-                <w:color w:val="000000"/>
-                <w:sz w:val="17"/>
-                <w:szCs w:val="17"/>
-              </w:rPr>
-              <w:t xml:space="preserve">  ?b rdf:type pkg:PretermBirth .</w:t>
-            </w:r>
-          </w:p>
-          <w:p>
-            <w:pPr>
-              <w:spacing w:after="0" w:before="0"/>
-              <w:jc w:val="left"/>
-            </w:pPr>
-            <w:r>
-              <w:rPr>
-                <w:rFonts w:ascii="Courier New" w:cs="Courier New" w:eastAsia="Courier New" w:hAnsi="Courier New"/>
-                <w:b w:val="false"/>
-                <w:bCs w:val="false"/>
-                <w:i w:val="false"/>
-                <w:iCs w:val="false"/>
-                <w:color w:val="000000"/>
-                <w:sz w:val="17"/>
-                <w:szCs w:val="17"/>
-              </w:rPr>
-              <w:t xml:space="preserve">  ?b pkg:exposedTo ?exp .</w:t>
-            </w:r>
-          </w:p>
-          <w:p>
-            <w:pPr>
-              <w:spacing w:after="0" w:before="0"/>
-              <w:jc w:val="left"/>
-            </w:pPr>
-            <w:r>
-              <w:rPr>
-                <w:rFonts w:ascii="Courier New" w:cs="Courier New" w:eastAsia="Courier New" w:hAnsi="Courier New"/>
-                <w:b w:val="false"/>
-                <w:bCs w:val="false"/>
-                <w:i w:val="false"/>
-                <w:iCs w:val="false"/>
-                <w:color w:val="000000"/>
-                <w:sz w:val="17"/>
-                <w:szCs w:val="17"/>
-              </w:rPr>
-              <w:t xml:space="preserve">  ?exp rdf:type pkg:ExtremeHeatExposure .</w:t>
-            </w:r>
-          </w:p>
-          <w:p>
-            <w:pPr>
-              <w:spacing w:after="0" w:before="0"/>
-              <w:jc w:val="left"/>
-            </w:pPr>
-            <w:r>
-              <w:rPr>
-                <w:rFonts w:ascii="Courier New" w:cs="Courier New" w:eastAsia="Courier New" w:hAnsi="Courier New"/>
-                <w:b w:val="false"/>
-                <w:bCs w:val="false"/>
-                <w:i w:val="false"/>
-                <w:iCs w:val="false"/>
-                <w:color w:val="000000"/>
-                <w:sz w:val="17"/>
-                <w:szCs w:val="17"/>
-              </w:rPr>
-              <w:t xml:space="preserve">  ?b pkg:bornIn ?municipality .</w:t>
-            </w:r>
-          </w:p>
-          <w:p>
-            <w:pPr>
-              <w:spacing w:after="0" w:before="0"/>
-              <w:jc w:val="left"/>
-            </w:pPr>
-            <w:r>
-              <w:rPr>
-                <w:rFonts w:ascii="Courier New" w:cs="Courier New" w:eastAsia="Courier New" w:hAnsi="Courier New"/>
-                <w:b w:val="false"/>
-                <w:bCs w:val="false"/>
-                <w:i w:val="false"/>
-                <w:iCs w:val="false"/>
-                <w:color w:val="000000"/>
-                <w:sz w:val="17"/>
-                <w:szCs w:val="17"/>
-              </w:rPr>
-              <w:t xml:space="preserve">}</w:t>
-            </w:r>
-          </w:p>
-          <w:p>
-            <w:pPr>
-              <w:spacing w:after="0" w:before="0"/>
-              <w:jc w:val="left"/>
-            </w:pPr>
-            <w:r>
-              <w:rPr>
-                <w:rFonts w:ascii="Courier New" w:cs="Courier New" w:eastAsia="Courier New" w:hAnsi="Courier New"/>
-                <w:b w:val="false"/>
-                <w:bCs w:val="false"/>
-                <w:i w:val="false"/>
-                <w:iCs w:val="false"/>
-                <w:color w:val="000000"/>
-                <w:sz w:val="17"/>
-                <w:szCs w:val="17"/>
-              </w:rPr>
-              <w:t xml:space="preserve">GROUP BY ?municipality</w:t>
-            </w:r>
-          </w:p>
-          <w:p>
-            <w:pPr>
-              <w:spacing w:after="0" w:before="0"/>
-              <w:jc w:val="left"/>
-            </w:pPr>
-            <w:r>
-              <w:rPr>
-                <w:rFonts w:ascii="Courier New" w:cs="Courier New" w:eastAsia="Courier New" w:hAnsi="Courier New"/>
-                <w:b w:val="false"/>
-                <w:bCs w:val="false"/>
-                <w:i w:val="false"/>
-                <w:iCs w:val="false"/>
-                <w:color w:val="000000"/>
-                <w:sz w:val="17"/>
-                <w:szCs w:val="17"/>
-              </w:rPr>
-              <w:t xml:space="preserve">ORDER BY DESC(?n_preterm_heat)</w:t>
+              <w:t xml:space="preserve">  ?b pkg:birthWeight ?w }</w:t>
             </w:r>
           </w:p>
         </w:tc>
@@ -2136,7 +3253,7 @@
                 <w:sz w:val="20"/>
                 <w:szCs w:val="20"/>
               </w:rPr>
-              <w:t xml:space="preserve">245 municipalities</w:t>
+              <w:t xml:space="preserve">3,141 g</w:t>
             </w:r>
           </w:p>
         </w:tc>
@@ -2171,7 +3288,147 @@
                 <w:sz w:val="20"/>
                 <w:szCs w:val="20"/>
               </w:rPr>
-              <w:t xml:space="preserve">1.13</w:t>
+              <w:t xml:space="preserve">0.350</w:t>
+            </w:r>
+          </w:p>
+        </w:tc>
+        <w:tc>
+          <w:tcPr>
+            <w:tcBorders>
+              <w:top w:val="none" w:color="FFFFFF" w:sz="0"/>
+              <w:left w:val="none" w:color="FFFFFF" w:sz="0"/>
+              <w:bottom w:val="single" w:color="000000" w:sz="6" w:space="1"/>
+              <w:right w:val="none" w:color="FFFFFF" w:sz="0"/>
+            </w:tcBorders>
+            <w:tcMar>
+              <w:top w:type="dxa" w:w="80"/>
+              <w:left w:type="dxa" w:w="160"/>
+              <w:bottom w:type="dxa" w:w="80"/>
+              <w:right w:type="dxa" w:w="160"/>
+            </w:tcMar>
+          </w:tcPr>
+          <w:p>
+            <w:pPr>
+              <w:spacing w:after="0" w:before="0"/>
+              <w:jc w:val="right"/>
+            </w:pPr>
+            <w:r>
+              <w:rPr>
+                <w:rFonts w:ascii="Times New Roman" w:cs="Times New Roman" w:eastAsia="Times New Roman" w:hAnsi="Times New Roman"/>
+                <w:b w:val="false"/>
+                <w:bCs w:val="false"/>
+                <w:i w:val="false"/>
+                <w:iCs w:val="false"/>
+                <w:color w:val="000000"/>
+                <w:sz w:val="20"/>
+                <w:szCs w:val="20"/>
+              </w:rPr>
+              <w:t xml:space="preserve">0.032</w:t>
+            </w:r>
+          </w:p>
+        </w:tc>
+        <w:tc>
+          <w:tcPr>
+            <w:tcBorders>
+              <w:top w:val="none" w:color="FFFFFF" w:sz="0"/>
+              <w:left w:val="none" w:color="FFFFFF" w:sz="0"/>
+              <w:bottom w:val="single" w:color="000000" w:sz="6" w:space="1"/>
+              <w:right w:val="none" w:color="FFFFFF" w:sz="0"/>
+            </w:tcBorders>
+            <w:tcMar>
+              <w:top w:type="dxa" w:w="80"/>
+              <w:left w:type="dxa" w:w="160"/>
+              <w:bottom w:type="dxa" w:w="80"/>
+              <w:right w:type="dxa" w:w="160"/>
+            </w:tcMar>
+          </w:tcPr>
+          <w:p>
+            <w:pPr>
+              <w:spacing w:after="0" w:before="0"/>
+              <w:jc w:val="right"/>
+            </w:pPr>
+            <w:r>
+              <w:rPr>
+                <w:rFonts w:ascii="Times New Roman" w:cs="Times New Roman" w:eastAsia="Times New Roman" w:hAnsi="Times New Roman"/>
+                <w:b w:val="false"/>
+                <w:bCs w:val="false"/>
+                <w:i w:val="false"/>
+                <w:iCs w:val="false"/>
+                <w:color w:val="000000"/>
+                <w:sz w:val="20"/>
+                <w:szCs w:val="20"/>
+              </w:rPr>
+              <w:t xml:space="preserve">0.006</w:t>
+            </w:r>
+          </w:p>
+        </w:tc>
+        <w:tc>
+          <w:tcPr>
+            <w:tcBorders>
+              <w:top w:val="none" w:color="FFFFFF" w:sz="0"/>
+              <w:left w:val="none" w:color="FFFFFF" w:sz="0"/>
+              <w:bottom w:val="single" w:color="000000" w:sz="6" w:space="1"/>
+              <w:right w:val="none" w:color="FFFFFF" w:sz="0"/>
+            </w:tcBorders>
+            <w:tcMar>
+              <w:top w:type="dxa" w:w="80"/>
+              <w:left w:type="dxa" w:w="160"/>
+              <w:bottom w:type="dxa" w:w="80"/>
+              <w:right w:type="dxa" w:w="160"/>
+            </w:tcMar>
+          </w:tcPr>
+          <w:p>
+            <w:pPr>
+              <w:spacing w:after="0" w:before="0"/>
+              <w:jc w:val="right"/>
+            </w:pPr>
+            <w:r>
+              <w:rPr>
+                <w:rFonts w:ascii="Times New Roman" w:cs="Times New Roman" w:eastAsia="Times New Roman" w:hAnsi="Times New Roman"/>
+                <w:b w:val="false"/>
+                <w:bCs w:val="false"/>
+                <w:i w:val="false"/>
+                <w:iCs w:val="false"/>
+                <w:color w:val="000000"/>
+                <w:sz w:val="20"/>
+                <w:szCs w:val="20"/>
+              </w:rPr>
+              <w:t xml:space="preserve">&lt;0.001</w:t>
+            </w:r>
+          </w:p>
+        </w:tc>
+        <w:tc>
+          <w:tcPr>
+            <w:tcBorders>
+              <w:top w:val="none" w:color="FFFFFF" w:sz="0"/>
+              <w:left w:val="none" w:color="FFFFFF" w:sz="0"/>
+              <w:bottom w:val="single" w:color="000000" w:sz="6" w:space="1"/>
+              <w:right w:val="none" w:color="FFFFFF" w:sz="0"/>
+            </w:tcBorders>
+            <w:tcMar>
+              <w:top w:type="dxa" w:w="80"/>
+              <w:left w:type="dxa" w:w="160"/>
+              <w:bottom w:type="dxa" w:w="80"/>
+              <w:right w:type="dxa" w:w="160"/>
+            </w:tcMar>
+          </w:tcPr>
+          <w:p>
+            <w:pPr>
+              <w:spacing w:after="0" w:before="0"/>
+              <w:jc w:val="right"/>
+            </w:pPr>
+            <w:r>
+              <w:rPr>
+                <w:rFonts w:ascii="Times New Roman" w:cs="Times New Roman" w:eastAsia="Times New Roman" w:hAnsi="Times New Roman"/>
+                <w:b w:val="false"/>
+                <w:bCs w:val="false"/>
+                <w:i w:val="false"/>
+                <w:iCs w:val="false"/>
+                <w:color w:val="000000"/>
+                <w:sz w:val="20"/>
+                <w:szCs w:val="20"/>
+              </w:rPr>
+              <w:t xml:space="preserve">58×</w:t>
             </w:r>
           </w:p>
         </w:tc>
@@ -2225,7 +3482,7 @@
           <w:sz w:val="20"/>
           <w:szCs w:val="20"/>
         </w:rPr>
-        <w:t xml:space="preserve">Q2 returns 934,806 distinct Birth individuals. Source Parquet files contain 934,807 records; one record carries a duplicate birth_id across annual files and is deduplicated by the TDB2 triplestore during loading, yielding 934,806 distinct nodes in the knowledge graph.</w:t>
+        <w:t xml:space="preserve">Q2 returns 934,806 distinct Birth individuals. Source Parquet files contain 934,807 records; one record carries a duplicate birth_id across annual files and is deduplicated by TDB2 during loading.</w:t>
       </w:r>
     </w:p>
     <w:p>
@@ -2257,7 +3514,7 @@
           <w:sz w:val="20"/>
           <w:szCs w:val="20"/>
         </w:rPr>
-        <w:t xml:space="preserve">Extreme heat exposure (ExtremeHeatExposure): defined as at least one day with maximum daily temperature (T</w:t>
+        <w:t xml:space="preserve">Extreme heat exposure (ExtremeHeatExposure): T</w:t>
       </w:r>
       <w:r>
         <w:rPr>
@@ -2283,12 +3540,12 @@
           <w:sz w:val="20"/>
           <w:szCs w:val="20"/>
         </w:rPr>
-        <w:t xml:space="preserve">) exceeding 35°C during the third trimester (weeks 27 to birth), based on BR-DWGD gridded daily temperature data; threshold applied uniformly across all municipalities.</w:t>
+        <w:t xml:space="preserve"> &gt; 35°C on ≥1 day during the third trimester (weeks 27 to birth), based on BR-DWGD gridded daily data; threshold applied uniformly across all municipalities.</w:t>
       </w:r>
     </w:p>
     <w:p>
       <w:pPr>
-        <w:spacing w:after="0" w:before="0"/>
+        <w:spacing w:after="80" w:before="0"/>
         <w:jc w:val="both"/>
       </w:pPr>
       <w:r>
@@ -2315,12 +3572,161 @@
           <w:sz w:val="20"/>
           <w:szCs w:val="20"/>
         </w:rPr>
-        <w:t xml:space="preserve">Q8 result: 245 of 246 Goiás municipalities returned at least one matched record. The municipality with the highest count was Goiânia (IBGE code 520870; n = 11,035 preterm births with extreme heat exposure during T3).</w:t>
+        <w:t xml:space="preserve">Q7 exhibited TDB2 cache warm-up effects across repetitions (range 0.51–2.65 s). The reported SD (0.793 s) reflects this warm-up; the median across repetitions was 2.17 s.</w:t>
+      </w:r>
+    </w:p>
+    <w:p>
+      <w:pPr>
+        <w:spacing w:after="0" w:before="0"/>
+        <w:jc w:val="both"/>
+      </w:pPr>
+      <w:r>
+        <w:rPr>
+          <w:rFonts w:ascii="Times New Roman" w:cs="Times New Roman" w:eastAsia="Times New Roman" w:hAnsi="Times New Roman"/>
+          <w:b w:val="false"/>
+          <w:bCs w:val="false"/>
+          <w:i w:val="false"/>
+          <w:iCs w:val="false"/>
+          <w:color w:val="000000"/>
+          <w:sz w:val="20"/>
+          <w:szCs w:val="20"/>
+        </w:rPr>
+        <w:t xml:space="preserve">SQL queries for reference: Q3: </w:t>
+      </w:r>
+      <w:r>
+        <w:rPr>
+          <w:rFonts w:ascii="Courier New" w:cs="Courier New" w:eastAsia="Courier New" w:hAnsi="Courier New"/>
+          <w:b w:val="false"/>
+          <w:bCs w:val="false"/>
+          <w:i w:val="false"/>
+          <w:iCs w:val="false"/>
+          <w:color w:val="000000"/>
+          <w:sz w:val="17"/>
+          <w:szCs w:val="17"/>
+        </w:rPr>
+        <w:t xml:space="preserve">WHERE gestational_weeks &lt; 37</w:t>
+      </w:r>
+      <w:r>
+        <w:rPr>
+          <w:rFonts w:ascii="Times New Roman" w:cs="Times New Roman" w:eastAsia="Times New Roman" w:hAnsi="Times New Roman"/>
+          <w:b w:val="false"/>
+          <w:bCs w:val="false"/>
+          <w:i w:val="false"/>
+          <w:iCs w:val="false"/>
+          <w:color w:val="000000"/>
+          <w:sz w:val="20"/>
+          <w:szCs w:val="20"/>
+        </w:rPr>
+        <w:t xml:space="preserve">; Q4: </w:t>
+      </w:r>
+      <w:r>
+        <w:rPr>
+          <w:rFonts w:ascii="Courier New" w:cs="Courier New" w:eastAsia="Courier New" w:hAnsi="Courier New"/>
+          <w:b w:val="false"/>
+          <w:bCs w:val="false"/>
+          <w:i w:val="false"/>
+          <w:iCs w:val="false"/>
+          <w:color w:val="000000"/>
+          <w:sz w:val="17"/>
+          <w:szCs w:val="17"/>
+        </w:rPr>
+        <w:t xml:space="preserve">WHERE gestational_weeks &gt;= 37 AND &lt; 42</w:t>
+      </w:r>
+      <w:r>
+        <w:rPr>
+          <w:rFonts w:ascii="Times New Roman" w:cs="Times New Roman" w:eastAsia="Times New Roman" w:hAnsi="Times New Roman"/>
+          <w:b w:val="false"/>
+          <w:bCs w:val="false"/>
+          <w:i w:val="false"/>
+          <w:iCs w:val="false"/>
+          <w:color w:val="000000"/>
+          <w:sz w:val="20"/>
+          <w:szCs w:val="20"/>
+        </w:rPr>
+        <w:t xml:space="preserve">; Q5: </w:t>
+      </w:r>
+      <w:r>
+        <w:rPr>
+          <w:rFonts w:ascii="Courier New" w:cs="Courier New" w:eastAsia="Courier New" w:hAnsi="Courier New"/>
+          <w:b w:val="false"/>
+          <w:bCs w:val="false"/>
+          <w:i w:val="false"/>
+          <w:iCs w:val="false"/>
+          <w:color w:val="000000"/>
+          <w:sz w:val="17"/>
+          <w:szCs w:val="17"/>
+        </w:rPr>
+        <w:t xml:space="preserve">WHERE gestational_weeks &gt;= 42</w:t>
+      </w:r>
+      <w:r>
+        <w:rPr>
+          <w:rFonts w:ascii="Times New Roman" w:cs="Times New Roman" w:eastAsia="Times New Roman" w:hAnsi="Times New Roman"/>
+          <w:b w:val="false"/>
+          <w:bCs w:val="false"/>
+          <w:i w:val="false"/>
+          <w:iCs w:val="false"/>
+          <w:color w:val="000000"/>
+          <w:sz w:val="20"/>
+          <w:szCs w:val="20"/>
+        </w:rPr>
+        <w:t xml:space="preserve">; Q6: </w:t>
+      </w:r>
+      <w:r>
+        <w:rPr>
+          <w:rFonts w:ascii="Courier New" w:cs="Courier New" w:eastAsia="Courier New" w:hAnsi="Courier New"/>
+          <w:b w:val="false"/>
+          <w:bCs w:val="false"/>
+          <w:i w:val="false"/>
+          <w:iCs w:val="false"/>
+          <w:color w:val="000000"/>
+          <w:sz w:val="17"/>
+          <w:szCs w:val="17"/>
+        </w:rPr>
+        <w:t xml:space="preserve">WHERE birth_weight_grams &lt; 2500</w:t>
+      </w:r>
+      <w:r>
+        <w:rPr>
+          <w:rFonts w:ascii="Times New Roman" w:cs="Times New Roman" w:eastAsia="Times New Roman" w:hAnsi="Times New Roman"/>
+          <w:b w:val="false"/>
+          <w:bCs w:val="false"/>
+          <w:i w:val="false"/>
+          <w:iCs w:val="false"/>
+          <w:color w:val="000000"/>
+          <w:sz w:val="20"/>
+          <w:szCs w:val="20"/>
+        </w:rPr>
+        <w:t xml:space="preserve">; Q7: </w:t>
+      </w:r>
+      <w:r>
+        <w:rPr>
+          <w:rFonts w:ascii="Courier New" w:cs="Courier New" w:eastAsia="Courier New" w:hAnsi="Courier New"/>
+          <w:b w:val="false"/>
+          <w:bCs w:val="false"/>
+          <w:i w:val="false"/>
+          <w:iCs w:val="false"/>
+          <w:color w:val="000000"/>
+          <w:sz w:val="17"/>
+          <w:szCs w:val="17"/>
+        </w:rPr>
+        <w:t xml:space="preserve">WHERE exposed_extreme_heat_t3 = 1</w:t>
+      </w:r>
+      <w:r>
+        <w:rPr>
+          <w:rFonts w:ascii="Times New Roman" w:cs="Times New Roman" w:eastAsia="Times New Roman" w:hAnsi="Times New Roman"/>
+          <w:b w:val="false"/>
+          <w:bCs w:val="false"/>
+          <w:i w:val="false"/>
+          <w:iCs w:val="false"/>
+          <w:color w:val="000000"/>
+          <w:sz w:val="20"/>
+          <w:szCs w:val="20"/>
+        </w:rPr>
+        <w:t xml:space="preserve">. Full SQL available in benchmark JSON.</w:t>
       </w:r>
     </w:p>
     <w:sectPr>
-      <w:pgSz w:w="15840" w:h="12240" w:orient="portrait"/>
-      <w:pgMar w:top="1440" w:right="1440" w:bottom="1440" w:left="1440" w:header="708" w:footer="708" w:gutter="0"/>
+      <w:pgSz w:w="20160" w:h="12240" w:orient="portrait"/>
+      <w:pgMar w:top="1440" w:right="1000" w:bottom="1440" w:left="1000" w:header="708" w:footer="708" w:gutter="0"/>
       <w:pgNumType/>
       <w:docGrid w:linePitch="360"/>
     </w:sectPr>

</xml_diff>